<commit_message>
Auto-ingest transcripts on deploy — no manual db management
- Transcripts folder is now committed to the repo
- start.sh runs ingest.py before starting the server on every deploy
- ingest.py skips already-ingested episodes so redeploys are fast
- python-docx added to requirements
- Removed temporary upload-db endpoint

To add a new episode: drop the .docx in transcripts/, push to git.
Railway redeploys, ingest runs, episode is live. That's it.

Co-Authored-By: Claude Sonnet 4.6 <noreply@anthropic.com>
</commit_message>
<xml_diff>
--- a/transcripts/Ep_1014_03_30_2026_Q_AF_Youtube.docx
+++ b/transcripts/Ep_1014_03_30_2026_Q_AF_Youtube.docx
@@ -30,7 +30,7 @@
           <w:b/>
           <w:bCs/>
         </w:rPr>
-        <w:t xml:space="preserve">Speaker 1 </w:t>
+        <w:t xml:space="preserve">Andy </w:t>
       </w:r>
       <w:r>
         <w:rPr>
@@ -329,7 +329,7 @@
           <w:b/>
           <w:bCs/>
         </w:rPr>
-        <w:t xml:space="preserve">Speaker 2 </w:t>
+        <w:t xml:space="preserve">DJ </w:t>
       </w:r>
       <w:r>
         <w:rPr>
@@ -516,7 +516,7 @@
           <w:b/>
           <w:bCs/>
         </w:rPr>
-        <w:t xml:space="preserve">Speaker 1 </w:t>
+        <w:t xml:space="preserve">Andy </w:t>
       </w:r>
       <w:r>
         <w:rPr>
@@ -2327,7 +2327,7 @@
           <w:b/>
           <w:bCs/>
         </w:rPr>
-        <w:t xml:space="preserve">Speaker 2 </w:t>
+        <w:t xml:space="preserve">DJ </w:t>
       </w:r>
       <w:r>
         <w:rPr>
@@ -2614,7 +2614,7 @@
           <w:b/>
           <w:bCs/>
         </w:rPr>
-        <w:t xml:space="preserve">Speaker 1 </w:t>
+        <w:t xml:space="preserve">Andy </w:t>
       </w:r>
       <w:r>
         <w:rPr>
@@ -2669,7 +2669,7 @@
           <w:b/>
           <w:bCs/>
         </w:rPr>
-        <w:t xml:space="preserve">Speaker 2 </w:t>
+        <w:t xml:space="preserve">DJ </w:t>
       </w:r>
       <w:r>
         <w:rPr>
@@ -2860,7 +2860,7 @@
           <w:b/>
           <w:bCs/>
         </w:rPr>
-        <w:t xml:space="preserve">Speaker 1 </w:t>
+        <w:t xml:space="preserve">Andy </w:t>
       </w:r>
       <w:r>
         <w:rPr>
@@ -2919,7 +2919,7 @@
           <w:b/>
           <w:bCs/>
         </w:rPr>
-        <w:t xml:space="preserve">Speaker 2 </w:t>
+        <w:t xml:space="preserve">DJ </w:t>
       </w:r>
       <w:r>
         <w:rPr>
@@ -3806,7 +3806,7 @@
           <w:b/>
           <w:bCs/>
         </w:rPr>
-        <w:t xml:space="preserve">Speaker 1 </w:t>
+        <w:t xml:space="preserve">Andy </w:t>
       </w:r>
       <w:r>
         <w:rPr>
@@ -5181,7 +5181,7 @@
           <w:b/>
           <w:bCs/>
         </w:rPr>
-        <w:t xml:space="preserve">Speaker 3 </w:t>
+        <w:t xml:space="preserve">DJ </w:t>
       </w:r>
       <w:r>
         <w:rPr>
@@ -5216,7 +5216,7 @@
           <w:b/>
           <w:bCs/>
         </w:rPr>
-        <w:t xml:space="preserve">Speaker 1 </w:t>
+        <w:t xml:space="preserve">Andy </w:t>
       </w:r>
       <w:r>
         <w:rPr>
@@ -8379,7 +8379,7 @@
           <w:b/>
           <w:bCs/>
         </w:rPr>
-        <w:t xml:space="preserve">Speaker 2 </w:t>
+        <w:t xml:space="preserve">DJ </w:t>
       </w:r>
       <w:r>
         <w:rPr>
@@ -8738,7 +8738,7 @@
           <w:b/>
           <w:bCs/>
         </w:rPr>
-        <w:t xml:space="preserve">Speaker 1 </w:t>
+        <w:t xml:space="preserve">Andy </w:t>
       </w:r>
       <w:r>
         <w:rPr>
@@ -10181,7 +10181,7 @@
           <w:b/>
           <w:bCs/>
         </w:rPr>
-        <w:t xml:space="preserve">Speaker 2 </w:t>
+        <w:t xml:space="preserve">DJ </w:t>
       </w:r>
       <w:r>
         <w:rPr>
@@ -10264,7 +10264,7 @@
           <w:b/>
           <w:bCs/>
         </w:rPr>
-        <w:t xml:space="preserve">Speaker 1 </w:t>
+        <w:t xml:space="preserve">Andy </w:t>
       </w:r>
       <w:r>
         <w:rPr>
@@ -10831,7 +10831,7 @@
           <w:b/>
           <w:bCs/>
         </w:rPr>
-        <w:t xml:space="preserve">Speaker 2 </w:t>
+        <w:t xml:space="preserve">DJ </w:t>
       </w:r>
       <w:r>
         <w:rPr>
@@ -10878,7 +10878,7 @@
           <w:b/>
           <w:bCs/>
         </w:rPr>
-        <w:t xml:space="preserve">Speaker 1 </w:t>
+        <w:t xml:space="preserve">Andy </w:t>
       </w:r>
       <w:r>
         <w:rPr>
@@ -13109,7 +13109,7 @@
           <w:b/>
           <w:bCs/>
         </w:rPr>
-        <w:t xml:space="preserve">Speaker 2 </w:t>
+        <w:t xml:space="preserve">DJ </w:t>
       </w:r>
       <w:r>
         <w:rPr>
@@ -13512,7 +13512,7 @@
           <w:b/>
           <w:bCs/>
         </w:rPr>
-        <w:t xml:space="preserve">Speaker 1 </w:t>
+        <w:t xml:space="preserve">Andy </w:t>
       </w:r>
       <w:r>
         <w:rPr>
@@ -14995,7 +14995,7 @@
           <w:b/>
           <w:bCs/>
         </w:rPr>
-        <w:t xml:space="preserve">Speaker 2 </w:t>
+        <w:t xml:space="preserve">DJ </w:t>
       </w:r>
       <w:r>
         <w:rPr>
@@ -15046,7 +15046,7 @@
           <w:b/>
           <w:bCs/>
         </w:rPr>
-        <w:t xml:space="preserve">Speaker 1 </w:t>
+        <w:t xml:space="preserve">Andy </w:t>
       </w:r>
       <w:r>
         <w:rPr>
@@ -15185,7 +15185,7 @@
           <w:b/>
           <w:bCs/>
         </w:rPr>
-        <w:t xml:space="preserve">Speaker 2 </w:t>
+        <w:t xml:space="preserve">DJ </w:t>
       </w:r>
       <w:r>
         <w:rPr>
@@ -15252,7 +15252,7 @@
           <w:b/>
           <w:bCs/>
         </w:rPr>
-        <w:t xml:space="preserve">Speaker 1 </w:t>
+        <w:t xml:space="preserve">Andy </w:t>
       </w:r>
       <w:r>
         <w:rPr>
@@ -16283,7 +16283,7 @@
           <w:b/>
           <w:bCs/>
         </w:rPr>
-        <w:t xml:space="preserve">Speaker 2 </w:t>
+        <w:t xml:space="preserve">DJ </w:t>
       </w:r>
       <w:r>
         <w:rPr>
@@ -16362,7 +16362,7 @@
           <w:b/>
           <w:bCs/>
         </w:rPr>
-        <w:t xml:space="preserve">Speaker 1 </w:t>
+        <w:t xml:space="preserve">Andy </w:t>
       </w:r>
       <w:r>
         <w:rPr>
@@ -18433,7 +18433,7 @@
           <w:b/>
           <w:bCs/>
         </w:rPr>
-        <w:t xml:space="preserve">Speaker 2 </w:t>
+        <w:t xml:space="preserve">DJ </w:t>
       </w:r>
       <w:r>
         <w:rPr>
@@ -18492,7 +18492,7 @@
           <w:b/>
           <w:bCs/>
         </w:rPr>
-        <w:t xml:space="preserve">Speaker 1 </w:t>
+        <w:t xml:space="preserve">Andy </w:t>
       </w:r>
       <w:r>
         <w:rPr>
@@ -19227,7 +19227,7 @@
           <w:b/>
           <w:bCs/>
         </w:rPr>
-        <w:t xml:space="preserve">Speaker 2 </w:t>
+        <w:t xml:space="preserve">DJ </w:t>
       </w:r>
       <w:r>
         <w:rPr>
@@ -19554,7 +19554,7 @@
           <w:b/>
           <w:bCs/>
         </w:rPr>
-        <w:t xml:space="preserve">Speaker 1 </w:t>
+        <w:t xml:space="preserve">Andy </w:t>
       </w:r>
       <w:r>
         <w:rPr>
@@ -21825,7 +21825,7 @@
           <w:b/>
           <w:bCs/>
         </w:rPr>
-        <w:t xml:space="preserve">Speaker 3 </w:t>
+        <w:t xml:space="preserve">DJ </w:t>
       </w:r>
       <w:r>
         <w:rPr>
@@ -21852,7 +21852,7 @@
           <w:b/>
           <w:bCs/>
         </w:rPr>
-        <w:t xml:space="preserve">Speaker 1 </w:t>
+        <w:t xml:space="preserve">Andy </w:t>
       </w:r>
       <w:r>
         <w:rPr>
@@ -24539,7 +24539,7 @@
           <w:b/>
           <w:bCs/>
         </w:rPr>
-        <w:t xml:space="preserve">Speaker 2 </w:t>
+        <w:t xml:space="preserve">DJ </w:t>
       </w:r>
       <w:r>
         <w:rPr>
@@ -24978,7 +24978,7 @@
           <w:b/>
           <w:bCs/>
         </w:rPr>
-        <w:t xml:space="preserve">Speaker 1 </w:t>
+        <w:t xml:space="preserve">Andy </w:t>
       </w:r>
       <w:r>
         <w:rPr>
@@ -25337,7 +25337,7 @@
           <w:b/>
           <w:bCs/>
         </w:rPr>
-        <w:t xml:space="preserve">Speaker 2 </w:t>
+        <w:t xml:space="preserve">DJ </w:t>
       </w:r>
       <w:r>
         <w:rPr>
@@ -25724,7 +25724,7 @@
           <w:b/>
           <w:bCs/>
         </w:rPr>
-        <w:t xml:space="preserve">Speaker 1 </w:t>
+        <w:t xml:space="preserve">Andy </w:t>
       </w:r>
       <w:r>
         <w:rPr>
@@ -26711,7 +26711,7 @@
           <w:b/>
           <w:bCs/>
         </w:rPr>
-        <w:t xml:space="preserve">Speaker 3 </w:t>
+        <w:t xml:space="preserve">DJ </w:t>
       </w:r>
       <w:r>
         <w:rPr>
@@ -26738,7 +26738,7 @@
           <w:b/>
           <w:bCs/>
         </w:rPr>
-        <w:t xml:space="preserve">Speaker 1 </w:t>
+        <w:t xml:space="preserve">Andy </w:t>
       </w:r>
       <w:r>
         <w:rPr>
@@ -29489,7 +29489,7 @@
           <w:b/>
           <w:bCs/>
         </w:rPr>
-        <w:t xml:space="preserve">Speaker 2 </w:t>
+        <w:t xml:space="preserve">DJ </w:t>
       </w:r>
       <w:r>
         <w:rPr>
@@ -29524,7 +29524,7 @@
           <w:b/>
           <w:bCs/>
         </w:rPr>
-        <w:t xml:space="preserve">Speaker 1 </w:t>
+        <w:t xml:space="preserve">Andy </w:t>
       </w:r>
       <w:r>
         <w:rPr>
@@ -29951,7 +29951,7 @@
           <w:b/>
           <w:bCs/>
         </w:rPr>
-        <w:t xml:space="preserve">Speaker 2 </w:t>
+        <w:t xml:space="preserve">DJ </w:t>
       </w:r>
       <w:r>
         <w:rPr>
@@ -30306,7 +30306,7 @@
           <w:b/>
           <w:bCs/>
         </w:rPr>
-        <w:t xml:space="preserve">Speaker 1 </w:t>
+        <w:t xml:space="preserve">Andy </w:t>
       </w:r>
       <w:r>
         <w:rPr>
@@ -32009,7 +32009,7 @@
           <w:b/>
           <w:bCs/>
         </w:rPr>
-        <w:t xml:space="preserve">Speaker 3 </w:t>
+        <w:t xml:space="preserve">DJ </w:t>
       </w:r>
       <w:r>
         <w:rPr>
@@ -32052,7 +32052,7 @@
           <w:b/>
           <w:bCs/>
         </w:rPr>
-        <w:t xml:space="preserve">Speaker 1 </w:t>
+        <w:t xml:space="preserve">Andy </w:t>
       </w:r>
       <w:r>
         <w:rPr>
@@ -32987,7 +32987,7 @@
           <w:b/>
           <w:bCs/>
         </w:rPr>
-        <w:t xml:space="preserve">Speaker 2 </w:t>
+        <w:t xml:space="preserve">DJ </w:t>
       </w:r>
       <w:r>
         <w:rPr>
@@ -33102,7 +33102,7 @@
           <w:b/>
           <w:bCs/>
         </w:rPr>
-        <w:t xml:space="preserve">Speaker 1 </w:t>
+        <w:t xml:space="preserve">Andy </w:t>
       </w:r>
       <w:r>
         <w:rPr>

</xml_diff>